<commit_message>
Made festival highlights bigger, arrive from 9, text darker for the sessions and removed only from Book Festival
</commit_message>
<xml_diff>
--- a/Non Web Site/Design/Festival Website Words.docx
+++ b/Non Web Site/Design/Festival Website Words.docx
@@ -21,6 +21,793 @@
       <w:proofErr w:type="gramEnd"/>
       <w:r>
         <w:t xml:space="preserve"> a maximum of 20 teams. email glospickle@gmail.com if you are interested in entering team/teams. Priority will be given to teams who were in second edition.</w:t>
+      </w:r>
+    </w:p>
+    <w:p/>
+    <w:p>
+      <w:r>
+        <w:t>We would like to invite you to our First Pickleball Festival which we are hosting jointly with the Gloucester Bombers.</w:t>
+      </w:r>
+    </w:p>
+    <w:p/>
+    <w:p>
+      <w:r>
+        <w:t>Whether you are looking to get some tournament practice or simply want to play for fun we have something for you.</w:t>
+      </w:r>
+    </w:p>
+    <w:p/>
+    <w:p>
+      <w:r>
+        <w:t xml:space="preserve">10 courts – all levels welcome </w:t>
+      </w:r>
+    </w:p>
+    <w:p>
+      <w:r>
+        <w:t xml:space="preserve">New to Pickleball Sessions, bookable at Freedom Leisure, 2 weeks prior to the </w:t>
+      </w:r>
+      <w:proofErr w:type="spellStart"/>
+      <w:r>
+        <w:t>evnt</w:t>
+      </w:r>
+      <w:proofErr w:type="spellEnd"/>
+      <w:r>
+        <w:t>.  These will be using additional courts</w:t>
+      </w:r>
+    </w:p>
+    <w:p>
+      <w:r>
+        <w:t>Pickleball World will be attending with stock of the latest pickleball equipment for that early Christmas Present shopping</w:t>
+      </w:r>
+    </w:p>
+    <w:p>
+      <w:r>
+        <w:t>Graded games 9:30 until 12:30</w:t>
+      </w:r>
+    </w:p>
+    <w:p>
+      <w:r>
+        <w:t xml:space="preserve">Social Play Mix Up 12:30 </w:t>
+      </w:r>
+      <w:proofErr w:type="spellStart"/>
+      <w:r>
+        <w:t>til</w:t>
+      </w:r>
+      <w:proofErr w:type="spellEnd"/>
+      <w:r>
+        <w:t xml:space="preserve"> 16:00</w:t>
+      </w:r>
+    </w:p>
+    <w:p/>
+    <w:p>
+      <w:r>
+        <w:rPr>
+          <w:u w:val="single"/>
+        </w:rPr>
+        <w:t>By participating, you are agreeing to the conditions below.</w:t>
+      </w:r>
+    </w:p>
+    <w:p>
+      <w:r>
+        <w:t>RELEASE, PERMISSION AND INDEMNITY AGREEMENT</w:t>
+      </w:r>
+    </w:p>
+    <w:p>
+      <w:r>
+        <w:t>"I</w:t>
+      </w:r>
+      <w:r>
+        <w:t xml:space="preserve"> </w:t>
+      </w:r>
+      <w:r>
+        <w:t>release</w:t>
+      </w:r>
+      <w:r>
+        <w:t xml:space="preserve"> a</w:t>
+      </w:r>
+      <w:r>
+        <w:t>nd</w:t>
+      </w:r>
+      <w:r>
+        <w:t xml:space="preserve"> discharge</w:t>
+      </w:r>
+      <w:r>
+        <w:t>,</w:t>
+      </w:r>
+      <w:r>
+        <w:t xml:space="preserve"> </w:t>
+      </w:r>
+      <w:r>
+        <w:t>for</w:t>
+      </w:r>
+      <w:r>
+        <w:t xml:space="preserve"> </w:t>
+      </w:r>
+      <w:r>
+        <w:t>myself,</w:t>
+      </w:r>
+      <w:r>
+        <w:t xml:space="preserve"> </w:t>
+      </w:r>
+      <w:r>
+        <w:t>my</w:t>
+      </w:r>
+      <w:r>
+        <w:t xml:space="preserve"> </w:t>
+      </w:r>
+      <w:r>
+        <w:t>heirs,</w:t>
+      </w:r>
+      <w:r>
+        <w:t xml:space="preserve"> </w:t>
+      </w:r>
+      <w:r>
+        <w:t>executors,</w:t>
+      </w:r>
+      <w:r>
+        <w:t xml:space="preserve"> </w:t>
+      </w:r>
+      <w:r>
+        <w:t>and</w:t>
+      </w:r>
+      <w:r>
+        <w:t xml:space="preserve"> </w:t>
+      </w:r>
+      <w:r>
+        <w:t>administrators,</w:t>
+      </w:r>
+      <w:r>
+        <w:t xml:space="preserve"> </w:t>
+      </w:r>
+      <w:r>
+        <w:t>the</w:t>
+      </w:r>
+      <w:r>
+        <w:t xml:space="preserve"> </w:t>
+      </w:r>
+      <w:r>
+        <w:t>organiser’s,</w:t>
+      </w:r>
+      <w:r>
+        <w:t xml:space="preserve"> </w:t>
+      </w:r>
+      <w:r>
+        <w:t>the</w:t>
+      </w:r>
+      <w:r>
+        <w:t xml:space="preserve"> </w:t>
+      </w:r>
+      <w:r>
+        <w:t>facility,</w:t>
+      </w:r>
+      <w:r>
+        <w:t xml:space="preserve"> </w:t>
+      </w:r>
+      <w:r>
+        <w:t>its</w:t>
+      </w:r>
+      <w:r>
+        <w:t xml:space="preserve"> </w:t>
+      </w:r>
+      <w:r>
+        <w:t>members,</w:t>
+      </w:r>
+      <w:r>
+        <w:t xml:space="preserve"> </w:t>
+      </w:r>
+      <w:r>
+        <w:t>employees</w:t>
+      </w:r>
+      <w:r>
+        <w:t xml:space="preserve"> </w:t>
+      </w:r>
+      <w:r>
+        <w:t>and</w:t>
+      </w:r>
+      <w:r>
+        <w:t xml:space="preserve"> </w:t>
+      </w:r>
+      <w:r>
+        <w:t>all</w:t>
+      </w:r>
+      <w:r>
+        <w:t xml:space="preserve"> </w:t>
+      </w:r>
+      <w:r>
+        <w:t>persons</w:t>
+      </w:r>
+      <w:r>
+        <w:t xml:space="preserve"> </w:t>
+      </w:r>
+      <w:r>
+        <w:t>associated</w:t>
+      </w:r>
+      <w:r>
+        <w:t xml:space="preserve"> </w:t>
+      </w:r>
+      <w:r>
+        <w:t>with</w:t>
+      </w:r>
+      <w:r>
+        <w:t xml:space="preserve"> </w:t>
+      </w:r>
+      <w:r>
+        <w:t>the</w:t>
+      </w:r>
+      <w:r>
+        <w:t xml:space="preserve"> </w:t>
+      </w:r>
+      <w:r>
+        <w:t>session</w:t>
+      </w:r>
+      <w:r>
+        <w:t xml:space="preserve"> </w:t>
+      </w:r>
+      <w:r>
+        <w:t>from</w:t>
+      </w:r>
+      <w:r>
+        <w:t xml:space="preserve"> </w:t>
+      </w:r>
+      <w:r>
+        <w:t>all</w:t>
+      </w:r>
+      <w:r>
+        <w:t xml:space="preserve"> </w:t>
+      </w:r>
+      <w:r>
+        <w:t>claims,</w:t>
+      </w:r>
+      <w:r>
+        <w:t xml:space="preserve"> </w:t>
+      </w:r>
+      <w:r>
+        <w:t>damages,</w:t>
+      </w:r>
+      <w:r>
+        <w:t xml:space="preserve"> </w:t>
+      </w:r>
+      <w:r>
+        <w:t>rights</w:t>
+      </w:r>
+      <w:r>
+        <w:t xml:space="preserve"> </w:t>
+      </w:r>
+      <w:r>
+        <w:t>of</w:t>
+      </w:r>
+      <w:r>
+        <w:t xml:space="preserve"> </w:t>
+      </w:r>
+      <w:r>
+        <w:t>action</w:t>
+      </w:r>
+      <w:r>
+        <w:t xml:space="preserve"> </w:t>
+      </w:r>
+      <w:r>
+        <w:t>present</w:t>
+      </w:r>
+      <w:r>
+        <w:t xml:space="preserve"> </w:t>
+      </w:r>
+      <w:r>
+        <w:t>or</w:t>
+      </w:r>
+      <w:r>
+        <w:t xml:space="preserve"> </w:t>
+      </w:r>
+      <w:r>
+        <w:t>future</w:t>
+      </w:r>
+      <w:r>
+        <w:t xml:space="preserve"> </w:t>
+      </w:r>
+      <w:r>
+        <w:t>which</w:t>
+      </w:r>
+      <w:r>
+        <w:t xml:space="preserve"> </w:t>
+      </w:r>
+      <w:r>
+        <w:t>may</w:t>
+      </w:r>
+      <w:r>
+        <w:t xml:space="preserve"> </w:t>
+      </w:r>
+      <w:r>
+        <w:t>arise</w:t>
+      </w:r>
+      <w:r>
+        <w:t xml:space="preserve"> </w:t>
+      </w:r>
+      <w:r>
+        <w:t>in</w:t>
+      </w:r>
+      <w:r>
+        <w:t xml:space="preserve"> </w:t>
+      </w:r>
+      <w:r>
+        <w:t>connection</w:t>
+      </w:r>
+      <w:r>
+        <w:t xml:space="preserve"> </w:t>
+      </w:r>
+      <w:r>
+        <w:t>with</w:t>
+      </w:r>
+      <w:r>
+        <w:t xml:space="preserve"> </w:t>
+      </w:r>
+      <w:r>
+        <w:t>my</w:t>
+      </w:r>
+      <w:r>
+        <w:t xml:space="preserve"> </w:t>
+      </w:r>
+      <w:r>
+        <w:t>participation</w:t>
+      </w:r>
+      <w:r>
+        <w:t xml:space="preserve"> </w:t>
+      </w:r>
+      <w:r>
+        <w:t>in</w:t>
+      </w:r>
+      <w:r>
+        <w:t xml:space="preserve"> </w:t>
+      </w:r>
+      <w:r>
+        <w:t>the</w:t>
+      </w:r>
+      <w:r>
+        <w:t xml:space="preserve"> </w:t>
+      </w:r>
+      <w:r>
+        <w:t>session.</w:t>
+      </w:r>
+      <w:r>
+        <w:t xml:space="preserve"> </w:t>
+      </w:r>
+      <w:r>
+        <w:t>I</w:t>
+      </w:r>
+      <w:r>
+        <w:t xml:space="preserve"> </w:t>
+      </w:r>
+      <w:r>
+        <w:t>understand</w:t>
+      </w:r>
+      <w:r>
+        <w:t xml:space="preserve"> </w:t>
+      </w:r>
+      <w:r>
+        <w:t>that</w:t>
+      </w:r>
+      <w:r>
+        <w:t xml:space="preserve"> </w:t>
+      </w:r>
+      <w:r>
+        <w:t>filming</w:t>
+      </w:r>
+      <w:r>
+        <w:t xml:space="preserve"> </w:t>
+      </w:r>
+      <w:r>
+        <w:t>and</w:t>
+      </w:r>
+      <w:r>
+        <w:t xml:space="preserve"> </w:t>
+      </w:r>
+      <w:r>
+        <w:t>photographs</w:t>
+      </w:r>
+      <w:r>
+        <w:t xml:space="preserve"> </w:t>
+      </w:r>
+      <w:r>
+        <w:t>may</w:t>
+      </w:r>
+      <w:r>
+        <w:t xml:space="preserve"> </w:t>
+      </w:r>
+      <w:r>
+        <w:t>be</w:t>
+      </w:r>
+      <w:r>
+        <w:t xml:space="preserve"> </w:t>
+      </w:r>
+      <w:r>
+        <w:t>taken</w:t>
+      </w:r>
+      <w:r>
+        <w:t xml:space="preserve"> </w:t>
+      </w:r>
+      <w:r>
+        <w:t>at</w:t>
+      </w:r>
+      <w:r>
+        <w:t xml:space="preserve"> </w:t>
+      </w:r>
+      <w:r>
+        <w:t>this</w:t>
+      </w:r>
+      <w:r>
+        <w:t xml:space="preserve"> </w:t>
+      </w:r>
+      <w:r>
+        <w:t>event</w:t>
+      </w:r>
+      <w:r>
+        <w:t xml:space="preserve"> </w:t>
+      </w:r>
+      <w:r>
+        <w:t>and</w:t>
+      </w:r>
+      <w:r>
+        <w:t xml:space="preserve"> </w:t>
+      </w:r>
+      <w:r>
+        <w:t>I</w:t>
+      </w:r>
+      <w:r>
+        <w:t xml:space="preserve"> </w:t>
+      </w:r>
+      <w:r>
+        <w:t>give</w:t>
+      </w:r>
+      <w:r>
+        <w:t xml:space="preserve"> </w:t>
+      </w:r>
+      <w:r>
+        <w:t>permission</w:t>
+      </w:r>
+      <w:r>
+        <w:t xml:space="preserve"> </w:t>
+      </w:r>
+      <w:r>
+        <w:t>to</w:t>
+      </w:r>
+      <w:r>
+        <w:t xml:space="preserve"> </w:t>
+      </w:r>
+      <w:r>
+        <w:t>Pickleball</w:t>
+      </w:r>
+      <w:r>
+        <w:t xml:space="preserve"> </w:t>
+      </w:r>
+      <w:r>
+        <w:t>Gloucestershire</w:t>
+      </w:r>
+      <w:r>
+        <w:t xml:space="preserve"> </w:t>
+      </w:r>
+      <w:r>
+        <w:t>to</w:t>
+      </w:r>
+      <w:r>
+        <w:t xml:space="preserve"> </w:t>
+      </w:r>
+      <w:r>
+        <w:t>use</w:t>
+      </w:r>
+      <w:r>
+        <w:t xml:space="preserve"> </w:t>
+      </w:r>
+      <w:r>
+        <w:t>the</w:t>
+      </w:r>
+      <w:r>
+        <w:t xml:space="preserve"> </w:t>
+      </w:r>
+      <w:r>
+        <w:t>creative</w:t>
+      </w:r>
+      <w:r>
+        <w:t xml:space="preserve"> </w:t>
+      </w:r>
+      <w:r>
+        <w:t>content</w:t>
+      </w:r>
+      <w:r>
+        <w:t xml:space="preserve"> </w:t>
+      </w:r>
+      <w:r>
+        <w:t>to</w:t>
+      </w:r>
+      <w:r>
+        <w:t xml:space="preserve"> </w:t>
+      </w:r>
+      <w:r>
+        <w:t>advertise,</w:t>
+      </w:r>
+      <w:r>
+        <w:t xml:space="preserve"> </w:t>
+      </w:r>
+      <w:r>
+        <w:t>promote</w:t>
+      </w:r>
+      <w:r>
+        <w:t xml:space="preserve"> </w:t>
+      </w:r>
+      <w:r>
+        <w:t>or</w:t>
+      </w:r>
+      <w:r>
+        <w:t xml:space="preserve"> </w:t>
+      </w:r>
+      <w:r>
+        <w:t>showcase</w:t>
+      </w:r>
+      <w:r>
+        <w:t xml:space="preserve"> </w:t>
+      </w:r>
+      <w:r>
+        <w:t>pickleball</w:t>
+      </w:r>
+      <w:r>
+        <w:t xml:space="preserve"> </w:t>
+      </w:r>
+      <w:r>
+        <w:t>in</w:t>
+      </w:r>
+      <w:r>
+        <w:t xml:space="preserve"> </w:t>
+      </w:r>
+      <w:r>
+        <w:t>what</w:t>
+      </w:r>
+      <w:r>
+        <w:t xml:space="preserve"> </w:t>
+      </w:r>
+      <w:r>
+        <w:t>matter</w:t>
+      </w:r>
+      <w:r>
+        <w:t xml:space="preserve"> </w:t>
+      </w:r>
+      <w:r>
+        <w:t>they</w:t>
+      </w:r>
+      <w:r>
+        <w:t xml:space="preserve"> </w:t>
+      </w:r>
+      <w:r>
+        <w:t>deem</w:t>
+      </w:r>
+      <w:r>
+        <w:t xml:space="preserve"> </w:t>
+      </w:r>
+      <w:r>
+        <w:t>appropriate. I</w:t>
+      </w:r>
+      <w:r>
+        <w:t xml:space="preserve"> </w:t>
+      </w:r>
+      <w:r>
+        <w:t>understand</w:t>
+      </w:r>
+      <w:r>
+        <w:t xml:space="preserve"> </w:t>
+      </w:r>
+      <w:r>
+        <w:t>that</w:t>
+      </w:r>
+      <w:r>
+        <w:t xml:space="preserve"> </w:t>
+      </w:r>
+      <w:r>
+        <w:t>it</w:t>
+      </w:r>
+      <w:r>
+        <w:t xml:space="preserve"> </w:t>
+      </w:r>
+      <w:r>
+        <w:t>is</w:t>
+      </w:r>
+      <w:r>
+        <w:t xml:space="preserve"> </w:t>
+      </w:r>
+      <w:r>
+        <w:t>my</w:t>
+      </w:r>
+      <w:r>
+        <w:t xml:space="preserve"> </w:t>
+      </w:r>
+      <w:r>
+        <w:t>responsibility</w:t>
+      </w:r>
+      <w:r>
+        <w:t xml:space="preserve"> </w:t>
+      </w:r>
+      <w:r>
+        <w:t>to</w:t>
+      </w:r>
+      <w:r>
+        <w:t xml:space="preserve"> </w:t>
+      </w:r>
+      <w:r>
+        <w:t>make</w:t>
+      </w:r>
+      <w:r>
+        <w:t xml:space="preserve"> </w:t>
+      </w:r>
+      <w:r>
+        <w:t>it</w:t>
+      </w:r>
+      <w:r>
+        <w:t xml:space="preserve"> </w:t>
+      </w:r>
+      <w:r>
+        <w:t>known</w:t>
+      </w:r>
+      <w:r>
+        <w:t xml:space="preserve"> </w:t>
+      </w:r>
+      <w:r>
+        <w:t>that</w:t>
+      </w:r>
+      <w:r>
+        <w:t xml:space="preserve"> </w:t>
+      </w:r>
+      <w:r>
+        <w:t>I</w:t>
+      </w:r>
+      <w:r>
+        <w:t xml:space="preserve"> </w:t>
+      </w:r>
+      <w:r>
+        <w:t>do</w:t>
+      </w:r>
+      <w:r>
+        <w:t xml:space="preserve"> </w:t>
+      </w:r>
+      <w:r>
+        <w:t>not</w:t>
+      </w:r>
+      <w:r>
+        <w:t xml:space="preserve"> </w:t>
+      </w:r>
+      <w:r>
+        <w:t>wish</w:t>
+      </w:r>
+      <w:r>
+        <w:t xml:space="preserve"> </w:t>
+      </w:r>
+      <w:r>
+        <w:t>to</w:t>
+      </w:r>
+      <w:r>
+        <w:t xml:space="preserve"> </w:t>
+      </w:r>
+      <w:r>
+        <w:t>have</w:t>
+      </w:r>
+      <w:r>
+        <w:t xml:space="preserve"> </w:t>
+      </w:r>
+      <w:r>
+        <w:t>my</w:t>
+      </w:r>
+      <w:r>
+        <w:t xml:space="preserve"> </w:t>
+      </w:r>
+      <w:r>
+        <w:t>picture</w:t>
+      </w:r>
+      <w:r>
+        <w:t xml:space="preserve"> </w:t>
+      </w:r>
+      <w:r>
+        <w:t>taken</w:t>
+      </w:r>
+      <w:r>
+        <w:t xml:space="preserve"> </w:t>
+      </w:r>
+      <w:r>
+        <w:t>or</w:t>
+      </w:r>
+      <w:r>
+        <w:t xml:space="preserve"> </w:t>
+      </w:r>
+      <w:r>
+        <w:t>my</w:t>
+      </w:r>
+      <w:r>
+        <w:t xml:space="preserve"> </w:t>
+      </w:r>
+      <w:r>
+        <w:t>games</w:t>
+      </w:r>
+      <w:r>
+        <w:t xml:space="preserve"> </w:t>
+      </w:r>
+      <w:r>
+        <w:t>filmed.</w:t>
+      </w:r>
+      <w:r>
+        <w:t xml:space="preserve"> </w:t>
+      </w:r>
+      <w:r>
+        <w:t>Persons</w:t>
+      </w:r>
+      <w:r>
+        <w:t xml:space="preserve"> </w:t>
+      </w:r>
+      <w:r>
+        <w:t>aged</w:t>
+      </w:r>
+      <w:r>
+        <w:t xml:space="preserve"> </w:t>
+      </w:r>
+      <w:r>
+        <w:t>under</w:t>
+      </w:r>
+      <w:r>
+        <w:t xml:space="preserve"> </w:t>
+      </w:r>
+      <w:r>
+        <w:t>18</w:t>
+      </w:r>
+      <w:r>
+        <w:t xml:space="preserve"> </w:t>
+      </w:r>
+      <w:r>
+        <w:t>must</w:t>
+      </w:r>
+      <w:r>
+        <w:t xml:space="preserve"> </w:t>
+      </w:r>
+      <w:r>
+        <w:t>be</w:t>
+      </w:r>
+      <w:r>
+        <w:t xml:space="preserve"> </w:t>
+      </w:r>
+      <w:r>
+        <w:t>accompanied</w:t>
+      </w:r>
+      <w:r>
+        <w:t xml:space="preserve"> </w:t>
+      </w:r>
+      <w:r>
+        <w:t>by</w:t>
+      </w:r>
+      <w:r>
+        <w:t xml:space="preserve"> </w:t>
+      </w:r>
+      <w:r>
+        <w:t>a</w:t>
+      </w:r>
+      <w:r>
+        <w:t xml:space="preserve"> </w:t>
+      </w:r>
+      <w:r>
+        <w:t>responsible</w:t>
+      </w:r>
+      <w:r>
+        <w:t xml:space="preserve"> </w:t>
+      </w:r>
+      <w:r>
+        <w:t>adult</w:t>
+      </w:r>
+      <w:r>
+        <w:t xml:space="preserve"> </w:t>
+      </w:r>
+      <w:r>
+        <w:t>at</w:t>
+      </w:r>
+      <w:r>
+        <w:t xml:space="preserve"> </w:t>
+      </w:r>
+      <w:r>
+        <w:t>al</w:t>
+      </w:r>
+      <w:r>
+        <w:t xml:space="preserve">l </w:t>
+      </w:r>
+      <w:r>
+        <w:t>times."</w:t>
       </w:r>
     </w:p>
     <w:p/>
@@ -639,7 +1426,6 @@
   <w:style w:type="character" w:default="1" w:styleId="DefaultParagraphFont">
     <w:name w:val="Default Paragraph Font"/>
     <w:uiPriority w:val="1"/>
-    <w:semiHidden/>
     <w:unhideWhenUsed/>
   </w:style>
   <w:style w:type="table" w:default="1" w:styleId="TableNormal">
@@ -1269,4 +2055,16 @@
     </a:ext>
   </a:extLst>
 </a:theme>
+</file>
+
+<file path=customXml/item1.xml><?xml version="1.0" encoding="utf-8"?>
+<b:Sources xmlns:b="http://schemas.openxmlformats.org/officeDocument/2006/bibliography" xmlns="http://schemas.openxmlformats.org/officeDocument/2006/bibliography" SelectedStyle="\APASixthEditionOfficeOnline.xsl" StyleName="APA" Version="6"/>
+</file>
+
+<file path=customXml/itemProps1.xml><?xml version="1.0" encoding="utf-8"?>
+<ds:datastoreItem xmlns:ds="http://schemas.openxmlformats.org/officeDocument/2006/customXml" ds:itemID="{FB5586EF-8D4E-4D6F-90E9-99E644B472B4}">
+  <ds:schemaRefs>
+    <ds:schemaRef ds:uri="http://schemas.openxmlformats.org/officeDocument/2006/bibliography"/>
+  </ds:schemaRefs>
+</ds:datastoreItem>
 </file>
</xml_diff>

<commit_message>
Chnages to words by logo's
</commit_message>
<xml_diff>
--- a/Non Web Site/Design/Festival Website Words.docx
+++ b/Non Web Site/Design/Festival Website Words.docx
@@ -88,7 +88,31 @@
     </w:p>
     <w:p>
       <w:r>
-        <w:t>RELEASE, PERMISSION AND INDEMNITY AGREEMENT</w:t>
+        <w:t>RELEASE,</w:t>
+      </w:r>
+      <w:r>
+        <w:t xml:space="preserve"> </w:t>
+      </w:r>
+      <w:r>
+        <w:t>PERMISSION</w:t>
+      </w:r>
+      <w:r>
+        <w:t xml:space="preserve"> </w:t>
+      </w:r>
+      <w:r>
+        <w:t>AND</w:t>
+      </w:r>
+      <w:r>
+        <w:t xml:space="preserve"> </w:t>
+      </w:r>
+      <w:r>
+        <w:t>INDEMNITY</w:t>
+      </w:r>
+      <w:r>
+        <w:t xml:space="preserve"> </w:t>
+      </w:r>
+      <w:r>
+        <w:t>AGREEMENT</w:t>
       </w:r>
     </w:p>
     <w:p>
@@ -811,7 +835,28 @@
       </w:r>
     </w:p>
     <w:p/>
-    <w:p/>
+    <w:p>
+      <w:hyperlink r:id="rId5" w:history="1">
+        <w:r>
+          <w:rPr>
+            <w:rStyle w:val="Hyperlink"/>
+          </w:rPr>
+          <w:t>Code of co</w:t>
+        </w:r>
+        <w:r>
+          <w:rPr>
+            <w:rStyle w:val="Hyperlink"/>
+          </w:rPr>
+          <w:t>n</w:t>
+        </w:r>
+        <w:r>
+          <w:rPr>
+            <w:rStyle w:val="Hyperlink"/>
+          </w:rPr>
+          <w:t>duct</w:t>
+        </w:r>
+      </w:hyperlink>
+    </w:p>
     <w:p/>
     <w:sectPr>
       <w:pgSz w:w="11906" w:h="16838"/>
@@ -1739,6 +1784,41 @@
       <w:spacing w:val="5"/>
     </w:rPr>
   </w:style>
+  <w:style w:type="character" w:styleId="Hyperlink">
+    <w:name w:val="Hyperlink"/>
+    <w:basedOn w:val="DefaultParagraphFont"/>
+    <w:uiPriority w:val="99"/>
+    <w:unhideWhenUsed/>
+    <w:rsid w:val="00B04575"/>
+    <w:rPr>
+      <w:color w:val="467886" w:themeColor="hyperlink"/>
+      <w:u w:val="single"/>
+    </w:rPr>
+  </w:style>
+  <w:style w:type="character" w:styleId="UnresolvedMention">
+    <w:name w:val="Unresolved Mention"/>
+    <w:basedOn w:val="DefaultParagraphFont"/>
+    <w:uiPriority w:val="99"/>
+    <w:semiHidden/>
+    <w:unhideWhenUsed/>
+    <w:rsid w:val="00B04575"/>
+    <w:rPr>
+      <w:color w:val="605E5C"/>
+      <w:shd w:val="clear" w:color="auto" w:fill="E1DFDD"/>
+    </w:rPr>
+  </w:style>
+  <w:style w:type="character" w:styleId="FollowedHyperlink">
+    <w:name w:val="FollowedHyperlink"/>
+    <w:basedOn w:val="DefaultParagraphFont"/>
+    <w:uiPriority w:val="99"/>
+    <w:semiHidden/>
+    <w:unhideWhenUsed/>
+    <w:rsid w:val="00B04575"/>
+    <w:rPr>
+      <w:color w:val="96607D" w:themeColor="followedHyperlink"/>
+      <w:u w:val="single"/>
+    </w:rPr>
+  </w:style>
 </w:styles>
 </file>
 

</xml_diff>